<commit_message>
Revision and document writing
</commit_message>
<xml_diff>
--- a/Quarto.PxA/Populist_regression.docx
+++ b/Quarto.PxA/Populist_regression.docx
@@ -115,18 +115,18 @@
               <w:pStyle w:val="Compact"/>
             </w:pPr>
             <w:r>
-              <w:t xml:space="preserve">-2.213***</w:t>
-            </w:r>
-          </w:p>
-        </w:tc>
-        <w:tc>
-          <w:tcPr/>
-          <w:p>
-            <w:pPr>
-              <w:pStyle w:val="Compact"/>
-            </w:pPr>
-            <w:r>
-              <w:t xml:space="preserve">-2.998***</w:t>
+              <w:t xml:space="preserve">-2.093***</w:t>
+            </w:r>
+          </w:p>
+        </w:tc>
+        <w:tc>
+          <w:tcPr/>
+          <w:p>
+            <w:pPr>
+              <w:pStyle w:val="Compact"/>
+            </w:pPr>
+            <w:r>
+              <w:t xml:space="preserve">-2.808***</w:t>
             </w:r>
           </w:p>
         </w:tc>
@@ -180,18 +180,18 @@
               <w:pStyle w:val="Compact"/>
             </w:pPr>
             <w:r>
-              <w:t xml:space="preserve">(0.161)</w:t>
-            </w:r>
-          </w:p>
-        </w:tc>
-        <w:tc>
-          <w:tcPr/>
-          <w:p>
-            <w:pPr>
-              <w:pStyle w:val="Compact"/>
-            </w:pPr>
-            <w:r>
-              <w:t xml:space="preserve">(0.472)</w:t>
+              <w:t xml:space="preserve">(0.156)</w:t>
+            </w:r>
+          </w:p>
+        </w:tc>
+        <w:tc>
+          <w:tcPr/>
+          <w:p>
+            <w:pPr>
+              <w:pStyle w:val="Compact"/>
+            </w:pPr>
+            <w:r>
+              <w:t xml:space="preserve">(0.451)</w:t>
             </w:r>
           </w:p>
         </w:tc>
@@ -248,18 +248,18 @@
               <w:pStyle w:val="Compact"/>
             </w:pPr>
             <w:r>
-              <w:t xml:space="preserve">0.128***</w:t>
-            </w:r>
-          </w:p>
-        </w:tc>
-        <w:tc>
-          <w:tcPr/>
-          <w:p>
-            <w:pPr>
-              <w:pStyle w:val="Compact"/>
-            </w:pPr>
-            <w:r>
-              <w:t xml:space="preserve">0.242**</w:t>
+              <w:t xml:space="preserve">0.108***</w:t>
+            </w:r>
+          </w:p>
+        </w:tc>
+        <w:tc>
+          <w:tcPr/>
+          <w:p>
+            <w:pPr>
+              <w:pStyle w:val="Compact"/>
+            </w:pPr>
+            <w:r>
+              <w:t xml:space="preserve">0.211**</w:t>
             </w:r>
           </w:p>
         </w:tc>
@@ -313,18 +313,18 @@
               <w:pStyle w:val="Compact"/>
             </w:pPr>
             <w:r>
-              <w:t xml:space="preserve">(0.028)</w:t>
-            </w:r>
-          </w:p>
-        </w:tc>
-        <w:tc>
-          <w:tcPr/>
-          <w:p>
-            <w:pPr>
-              <w:pStyle w:val="Compact"/>
-            </w:pPr>
-            <w:r>
-              <w:t xml:space="preserve">(0.078)</w:t>
+              <w:t xml:space="preserve">(0.027)</w:t>
+            </w:r>
+          </w:p>
+        </w:tc>
+        <w:tc>
+          <w:tcPr/>
+          <w:p>
+            <w:pPr>
+              <w:pStyle w:val="Compact"/>
+            </w:pPr>
+            <w:r>
+              <w:t xml:space="preserve">(0.075)</w:t>
             </w:r>
           </w:p>
         </w:tc>
@@ -389,7 +389,7 @@
               <w:pStyle w:val="Compact"/>
             </w:pPr>
             <w:r>
-              <w:t xml:space="preserve">0.929</w:t>
+              <w:t xml:space="preserve">0.926+</w:t>
             </w:r>
           </w:p>
         </w:tc>
@@ -451,7 +451,7 @@
               <w:pStyle w:val="Compact"/>
             </w:pPr>
             <w:r>
-              <w:t xml:space="preserve">(0.586)</w:t>
+              <w:t xml:space="preserve">(0.558)</w:t>
             </w:r>
           </w:p>
         </w:tc>
@@ -516,7 +516,7 @@
               <w:pStyle w:val="Compact"/>
             </w:pPr>
             <w:r>
-              <w:t xml:space="preserve">1.658**</w:t>
+              <w:t xml:space="preserve">1.590**</w:t>
             </w:r>
           </w:p>
         </w:tc>
@@ -578,7 +578,7 @@
               <w:pStyle w:val="Compact"/>
             </w:pPr>
             <w:r>
-              <w:t xml:space="preserve">(0.582)</w:t>
+              <w:t xml:space="preserve">(0.554)</w:t>
             </w:r>
           </w:p>
         </w:tc>
@@ -643,7 +643,7 @@
               <w:pStyle w:val="Compact"/>
             </w:pPr>
             <w:r>
-              <w:t xml:space="preserve">1.068+</w:t>
+              <w:t xml:space="preserve">0.954+</w:t>
             </w:r>
           </w:p>
         </w:tc>
@@ -705,7 +705,7 @@
               <w:pStyle w:val="Compact"/>
             </w:pPr>
             <w:r>
-              <w:t xml:space="preserve">(0.594)</w:t>
+              <w:t xml:space="preserve">(0.571)</w:t>
             </w:r>
           </w:p>
         </w:tc>
@@ -770,7 +770,7 @@
               <w:pStyle w:val="Compact"/>
             </w:pPr>
             <w:r>
-              <w:t xml:space="preserve">0.178</w:t>
+              <w:t xml:space="preserve">-0.013</w:t>
             </w:r>
           </w:p>
         </w:tc>
@@ -832,7 +832,7 @@
               <w:pStyle w:val="Compact"/>
             </w:pPr>
             <w:r>
-              <w:t xml:space="preserve">(0.577)</w:t>
+              <w:t xml:space="preserve">(0.559)</w:t>
             </w:r>
           </w:p>
         </w:tc>
@@ -897,7 +897,7 @@
               <w:pStyle w:val="Compact"/>
             </w:pPr>
             <w:r>
-              <w:t xml:space="preserve">-0.104</w:t>
+              <w:t xml:space="preserve">-0.105</w:t>
             </w:r>
           </w:p>
         </w:tc>
@@ -956,7 +956,7 @@
               <w:pStyle w:val="Compact"/>
             </w:pPr>
             <w:r>
-              <w:t xml:space="preserve">(0.099)</w:t>
+              <w:t xml:space="preserve">(0.095)</w:t>
             </w:r>
           </w:p>
         </w:tc>
@@ -1018,7 +1018,7 @@
               <w:pStyle w:val="Compact"/>
             </w:pPr>
             <w:r>
-              <w:t xml:space="preserve">-0.281**</w:t>
+              <w:t xml:space="preserve">-0.271**</w:t>
             </w:r>
           </w:p>
         </w:tc>
@@ -1077,7 +1077,7 @@
               <w:pStyle w:val="Compact"/>
             </w:pPr>
             <w:r>
-              <w:t xml:space="preserve">(0.098)</w:t>
+              <w:t xml:space="preserve">(0.094)</w:t>
             </w:r>
           </w:p>
         </w:tc>
@@ -1139,7 +1139,7 @@
               <w:pStyle w:val="Compact"/>
             </w:pPr>
             <w:r>
-              <w:t xml:space="preserve">-0.139</w:t>
+              <w:t xml:space="preserve">-0.121</w:t>
             </w:r>
           </w:p>
         </w:tc>
@@ -1198,7 +1198,7 @@
               <w:pStyle w:val="Compact"/>
             </w:pPr>
             <w:r>
-              <w:t xml:space="preserve">(0.100)</w:t>
+              <w:t xml:space="preserve">(0.096)</w:t>
             </w:r>
           </w:p>
         </w:tc>
@@ -1260,7 +1260,7 @@
               <w:pStyle w:val="Compact"/>
             </w:pPr>
             <w:r>
-              <w:t xml:space="preserve">-0.022</w:t>
+              <w:t xml:space="preserve">0.009</w:t>
             </w:r>
           </w:p>
         </w:tc>
@@ -1319,7 +1319,7 @@
               <w:pStyle w:val="Compact"/>
             </w:pPr>
             <w:r>
-              <w:t xml:space="preserve">(0.096)</w:t>
+              <w:t xml:space="preserve">(0.093)</w:t>
             </w:r>
           </w:p>
         </w:tc>
@@ -1603,18 +1603,18 @@
               <w:pStyle w:val="Compact"/>
             </w:pPr>
             <w:r>
-              <w:t xml:space="preserve">3547</w:t>
-            </w:r>
-          </w:p>
-        </w:tc>
-        <w:tc>
-          <w:tcPr/>
-          <w:p>
-            <w:pPr>
-              <w:pStyle w:val="Compact"/>
-            </w:pPr>
-            <w:r>
-              <w:t xml:space="preserve">3547</w:t>
+              <w:t xml:space="preserve">3559</w:t>
+            </w:r>
+          </w:p>
+        </w:tc>
+        <w:tc>
+          <w:tcPr/>
+          <w:p>
+            <w:pPr>
+              <w:pStyle w:val="Compact"/>
+            </w:pPr>
+            <w:r>
+              <w:t xml:space="preserve">3559</w:t>
             </w:r>
           </w:p>
         </w:tc>
@@ -1671,18 +1671,18 @@
               <w:pStyle w:val="Compact"/>
             </w:pPr>
             <w:r>
-              <w:t xml:space="preserve">21.355</w:t>
-            </w:r>
-          </w:p>
-        </w:tc>
-        <w:tc>
-          <w:tcPr/>
-          <w:p>
-            <w:pPr>
-              <w:pStyle w:val="Compact"/>
-            </w:pPr>
-            <w:r>
-              <w:t xml:space="preserve">4.334</w:t>
+              <w:t xml:space="preserve">16.130</w:t>
+            </w:r>
+          </w:p>
+        </w:tc>
+        <w:tc>
+          <w:tcPr/>
+          <w:p>
+            <w:pPr>
+              <w:pStyle w:val="Compact"/>
+            </w:pPr>
+            <w:r>
+              <w:t xml:space="preserve">3.986</w:t>
             </w:r>
           </w:p>
         </w:tc>

</xml_diff>